<commit_message>
Base científica v0.3: reconciliación de la 1.ª entrega de Enrique (§17)
- Nueva §17 con la tabla de reconciliación punto a punto del escrito
  (docs/Escrito Enrique 01.docx): valida / matiza (10 umbrales
  discrepantes) / novedades (REC 1-5, MG1-3, valoración 6 h, retirada,
  Boussignac, memoria de parámetros) / dudas (a)-(h) para Enrique.
- Word de revisión regenerado y nuevo RESPUESTA_ENRIQUE_01.docx con las
  dudas, listo para enviárselo.
- base-cientifica.pdf (edición pública) regenerado, 0 referencias
  internas verificadas.
- El motor NO cambia hasta cerrar la reconciliación (documento primero).

Co-Authored-By: Claude Fable 5 <noreply@anthropic.com>
</commit_message>
<xml_diff>
--- a/docs/BASE_PUBLICA.docx
+++ b/docs/BASE_PUBLICA.docx
@@ -8971,25 +8971,7 @@
           <w:sz w:val="19"/>
           <w:szCs w:val="19"/>
         </w:rPr>
-        <w:t xml:space="preserve">según evolución (§5.4) alimentan el motor de la app → decisiones abiertas </w:t>
-      </w:r>
-      <w:r>
-        <w:rPr>
-          <w:b/>
-          <w:bCs/>
-          <w:color w:val="333333"/>
-          <w:sz w:val="19"/>
-          <w:szCs w:val="19"/>
-        </w:rPr>
-        <w:t xml:space="preserve">pendiente de revisión, pendiente de revisión y pendiente de revisión</w:t>
-      </w:r>
-      <w:r>
-        <w:rPr>
-          <w:color w:val="333333"/>
-          <w:sz w:val="19"/>
-          <w:szCs w:val="19"/>
-        </w:rPr>
-        <w:t xml:space="preserve"> (§14).</w:t>
+        <w:t xml:space="preserve">según evolución (§5.4) alimentan el motor de la app (pendientes de revisión).</w:t>
       </w:r>
     </w:p>
     <w:p>

</xml_diff>